<commit_message>
USQA-33 add PDF report generation
</commit_message>
<xml_diff>
--- a/SRS_doc.docx
+++ b/SRS_doc.docx
@@ -3807,7 +3807,13 @@
       </w:r>
       <w:proofErr w:type="spellEnd"/>
       <w:r>
-        <w:t xml:space="preserve"> u Markdown </w:t>
+        <w:t xml:space="preserve"> u </w:t>
+      </w:r>
+      <w:r>
+        <w:t>PDF</w:t>
+      </w:r>
+      <w:r>
+        <w:t xml:space="preserve"> </w:t>
       </w:r>
       <w:proofErr w:type="spellStart"/>
       <w:r>
@@ -4812,7 +4818,13 @@
       </w:r>
       <w:proofErr w:type="spellEnd"/>
       <w:r>
-        <w:t xml:space="preserve"> User Stories – data_loader.py – story_analyzer.py – ai_agent.py – Markdown </w:t>
+        <w:t xml:space="preserve"> User Stories – data_loader.py – story_analyzer.py – ai_agent.py – </w:t>
+      </w:r>
+      <w:r>
+        <w:t>PDF</w:t>
+      </w:r>
+      <w:r>
+        <w:t xml:space="preserve"> </w:t>
       </w:r>
       <w:proofErr w:type="spellStart"/>
       <w:r>
@@ -5320,7 +5332,19 @@
         <w:rPr>
           <w:lang w:val="sr-Latn-RS"/>
         </w:rPr>
-        <w:t>Čuvanje izveštaja u Markdown fajl</w:t>
+        <w:t xml:space="preserve">Čuvanje izveštaja u </w:t>
+      </w:r>
+      <w:r>
+        <w:rPr>
+          <w:lang w:val="sr-Latn-RS"/>
+        </w:rPr>
+        <w:t>PDF</w:t>
+      </w:r>
+      <w:r>
+        <w:rPr>
+          <w:lang w:val="sr-Latn-RS"/>
+        </w:rPr>
+        <w:t xml:space="preserve"> fajl</w:t>
       </w:r>
     </w:p>
     <w:p>
@@ -7223,7 +7247,13 @@
       </w:r>
       <w:proofErr w:type="spellEnd"/>
       <w:r>
-        <w:t xml:space="preserve"> Markdown </w:t>
+        <w:t xml:space="preserve"> </w:t>
+      </w:r>
+      <w:r>
+        <w:t>PDF</w:t>
+      </w:r>
+      <w:r>
+        <w:t xml:space="preserve"> </w:t>
       </w:r>
       <w:proofErr w:type="spellStart"/>
       <w:r>
@@ -7429,7 +7459,13 @@
       </w:r>
       <w:proofErr w:type="spellEnd"/>
       <w:r>
-        <w:t xml:space="preserve"> u Markdown </w:t>
+        <w:t xml:space="preserve"> u </w:t>
+      </w:r>
+      <w:r>
+        <w:t>PDF</w:t>
+      </w:r>
+      <w:r>
+        <w:t xml:space="preserve"> </w:t>
       </w:r>
       <w:proofErr w:type="spellStart"/>
       <w:r>
@@ -8759,7 +8795,13 @@
       </w:r>
       <w:proofErr w:type="spellEnd"/>
       <w:r>
-        <w:t xml:space="preserve"> Markdown </w:t>
+        <w:t xml:space="preserve"> </w:t>
+      </w:r>
+      <w:r>
+        <w:t>PDF</w:t>
+      </w:r>
+      <w:r>
+        <w:t xml:space="preserve"> </w:t>
       </w:r>
       <w:proofErr w:type="spellStart"/>
       <w:r>
@@ -11639,7 +11681,13 @@
             </w:r>
             <w:proofErr w:type="spellEnd"/>
             <w:r>
-              <w:t xml:space="preserve"> Markdown </w:t>
+              <w:t xml:space="preserve"> </w:t>
+            </w:r>
+            <w:r>
+              <w:t>PDF</w:t>
+            </w:r>
+            <w:r>
+              <w:t xml:space="preserve"> </w:t>
             </w:r>
             <w:proofErr w:type="spellStart"/>
             <w:r>
@@ -11905,7 +11953,13 @@
             </w:r>
             <w:proofErr w:type="spellEnd"/>
             <w:r>
-              <w:t xml:space="preserve"> je Markdown </w:t>
+              <w:t xml:space="preserve"> je </w:t>
+            </w:r>
+            <w:r>
+              <w:t>PDF</w:t>
+            </w:r>
+            <w:r>
+              <w:t xml:space="preserve"> </w:t>
             </w:r>
             <w:proofErr w:type="spellStart"/>
             <w:r>
@@ -12303,7 +12357,13 @@
             </w:r>
             <w:proofErr w:type="spellEnd"/>
             <w:r>
-              <w:t xml:space="preserve"> Markdown </w:t>
+              <w:t xml:space="preserve"> </w:t>
+            </w:r>
+            <w:r>
+              <w:t>PDF</w:t>
+            </w:r>
+            <w:r>
+              <w:t xml:space="preserve"> </w:t>
             </w:r>
             <w:proofErr w:type="spellStart"/>
             <w:r>
@@ -14690,7 +14750,19 @@
         <w:rPr>
           <w:lang w:val="sr-Latn-RS"/>
         </w:rPr>
-        <w:t>Upotrebljivost – izveštaj mora biti čitljiv i organizovan u jasne Markdown sekcije</w:t>
+        <w:t xml:space="preserve">Upotrebljivost – izveštaj mora biti čitljiv i organizovan u jasne </w:t>
+      </w:r>
+      <w:r>
+        <w:rPr>
+          <w:lang w:val="sr-Latn-RS"/>
+        </w:rPr>
+        <w:t>PDF</w:t>
+      </w:r>
+      <w:r>
+        <w:rPr>
+          <w:lang w:val="sr-Latn-RS"/>
+        </w:rPr>
+        <w:t xml:space="preserve"> sekcije</w:t>
       </w:r>
     </w:p>
     <w:p>
@@ -17264,7 +17336,13 @@
           </w:tcPr>
           <w:p>
             <w:r>
-              <w:t>String (Markdown)</w:t>
+              <w:t>String (</w:t>
+            </w:r>
+            <w:r>
+              <w:t>PDF</w:t>
+            </w:r>
+            <w:r>
+              <w:t>)</w:t>
             </w:r>
           </w:p>
         </w:tc>
@@ -17285,7 +17363,13 @@
             </w:r>
             <w:proofErr w:type="spellEnd"/>
             <w:r>
-              <w:t xml:space="preserve"> Markdown </w:t>
+              <w:t xml:space="preserve"> </w:t>
+            </w:r>
+            <w:r>
+              <w:t>PDF</w:t>
+            </w:r>
+            <w:r>
+              <w:t xml:space="preserve"> </w:t>
             </w:r>
             <w:proofErr w:type="spellStart"/>
             <w:r>
@@ -18014,7 +18098,13 @@
             </w:r>
             <w:proofErr w:type="spellEnd"/>
             <w:r>
-              <w:t xml:space="preserve"> Markdown </w:t>
+              <w:t xml:space="preserve"> </w:t>
+            </w:r>
+            <w:r>
+              <w:t>PDF</w:t>
+            </w:r>
+            <w:r>
+              <w:t xml:space="preserve"> </w:t>
             </w:r>
             <w:proofErr w:type="spellStart"/>
             <w:r>
@@ -18094,13 +18184,7 @@
           </w:tcPr>
           <w:p>
             <w:r>
-              <w:t>0</w:t>
-            </w:r>
-            <w:r>
-              <w:t>3</w:t>
-            </w:r>
-            <w:r>
-              <w:t>.07.2026.</w:t>
+              <w:t>03.07.2026.</w:t>
             </w:r>
           </w:p>
         </w:tc>
@@ -18143,13 +18227,7 @@
           </w:tcPr>
           <w:p>
             <w:r>
-              <w:t>0</w:t>
-            </w:r>
-            <w:r>
-              <w:t>3</w:t>
-            </w:r>
-            <w:r>
-              <w:t>.07.2026.</w:t>
+              <w:t>03.07.2026.</w:t>
             </w:r>
           </w:p>
         </w:tc>
@@ -18208,13 +18286,7 @@
           </w:tcPr>
           <w:p>
             <w:r>
-              <w:t>0</w:t>
-            </w:r>
-            <w:r>
-              <w:t>3</w:t>
-            </w:r>
-            <w:r>
-              <w:t>.07.2026.</w:t>
+              <w:t>03.07.2026.</w:t>
             </w:r>
           </w:p>
         </w:tc>
@@ -18286,13 +18358,7 @@
           </w:tcPr>
           <w:p>
             <w:r>
-              <w:t>0</w:t>
-            </w:r>
-            <w:r>
-              <w:t>3</w:t>
-            </w:r>
-            <w:r>
-              <w:t>.07.2026.</w:t>
+              <w:t>03.07.2026.</w:t>
             </w:r>
           </w:p>
         </w:tc>
@@ -18322,15 +18388,7 @@
             </w:r>
             <w:proofErr w:type="spellEnd"/>
             <w:r>
-              <w:t xml:space="preserve"> </w:t>
-            </w:r>
-            <w:proofErr w:type="spellStart"/>
-            <w:r>
-              <w:t>sa</w:t>
-            </w:r>
-            <w:proofErr w:type="spellEnd"/>
-            <w:r>
-              <w:t xml:space="preserve"> GitHub </w:t>
+              <w:t xml:space="preserve"> sa GitHub </w:t>
             </w:r>
             <w:proofErr w:type="spellStart"/>
             <w:r>
@@ -18587,7 +18645,13 @@
       </w:r>
       <w:proofErr w:type="spellEnd"/>
       <w:r>
-        <w:t xml:space="preserve"> Markdown </w:t>
+        <w:t xml:space="preserve"> </w:t>
+      </w:r>
+      <w:r>
+        <w:t>PDF</w:t>
+      </w:r>
+      <w:r>
+        <w:t xml:space="preserve"> </w:t>
       </w:r>
       <w:proofErr w:type="spellStart"/>
       <w:r>

</xml_diff>